<commit_message>
Update report to supplied template with AI acknowledgement
</commit_message>
<xml_diff>
--- a/docs/PROG2002 A2 Report.docx
+++ b/docs/PROG2002 A2 Report.docx
@@ -1,6 +1,6 @@
 
 <file path=word/document.xml><?xml version="1.0" encoding="utf-8"?>
-<w:document xmlns:wpc="http://schemas.microsoft.com/office/word/2010/wordprocessingCanvas" xmlns:cx="http://schemas.microsoft.com/office/drawing/2014/chartex" xmlns:cx1="http://schemas.microsoft.com/office/drawing/2015/9/8/chartex" xmlns:cx2="http://schemas.microsoft.com/office/drawing/2015/10/21/chartex" xmlns:cx3="http://schemas.microsoft.com/office/drawing/2016/5/9/chartex" xmlns:cx4="http://schemas.microsoft.com/office/drawing/2016/5/10/chartex" xmlns:cx5="http://schemas.microsoft.com/office/drawing/2016/5/11/chartex" xmlns:cx6="http://schemas.microsoft.com/office/drawing/2016/5/12/chartex" xmlns:cx7="http://schemas.microsoft.com/office/drawing/2016/5/13/chartex" xmlns:cx8="http://schemas.microsoft.com/office/drawing/2016/5/14/chartex" xmlns:mc="http://schemas.openxmlformats.org/markup-compatibility/2006" xmlns:aink="http://schemas.microsoft.com/office/drawing/2016/ink" xmlns:am3d="http://schemas.microsoft.com/office/drawing/2017/model3d" xmlns:o="urn:schemas-microsoft-com:office:office" xmlns:oel="http://schemas.microsoft.com/office/2019/extlst" xmlns:r="http://schemas.openxmlformats.org/officeDocument/2006/relationships" xmlns:m="http://schemas.openxmlformats.org/officeDocument/2006/math" xmlns:v="urn:schemas-microsoft-com:vml" xmlns:wp14="http://schemas.microsoft.com/office/word/2010/wordprocessingDrawing" xmlns:wp="http://schemas.openxmlformats.org/drawingml/2006/wordprocessingDrawing" xmlns:w10="urn:schemas-microsoft-com:office:word" xmlns:w="http://schemas.openxmlformats.org/wordprocessingml/2006/main" xmlns:w14="http://schemas.microsoft.com/office/word/2010/wordml" xmlns:w15="http://schemas.microsoft.com/office/word/2012/wordml" xmlns:w16cex="http://schemas.microsoft.com/office/word/2018/wordml/cex" xmlns:w16cid="http://schemas.microsoft.com/office/word/2016/wordml/cid" xmlns:w16="http://schemas.microsoft.com/office/word/2018/wordml" xmlns:w16du="http://schemas.microsoft.com/office/word/2023/wordml/word16du" xmlns:w16sdtdh="http://schemas.microsoft.com/office/word/2020/wordml/sdtdatahash" xmlns:w16sdtfl="http://schemas.microsoft.com/office/word/2024/wordml/sdtformatlock" xmlns:w16se="http://schemas.microsoft.com/office/word/2015/wordml/symex" xmlns:wpg="http://schemas.microsoft.com/office/word/2010/wordprocessingGroup" xmlns:wpi="http://schemas.microsoft.com/office/word/2010/wordprocessingInk" xmlns:wne="http://schemas.microsoft.com/office/word/2006/wordml" xmlns:wps="http://schemas.microsoft.com/office/word/2010/wordprocessingShape" mc:Ignorable="w14 w15 w16se w16cid w16 w16cex w16sdtdh w16sdtfl w16du wp14">
+<w:document xmlns:wpc="http://schemas.microsoft.com/office/word/2010/wordprocessingCanvas" xmlns:cx="http://schemas.microsoft.com/office/drawing/2014/chartex" xmlns:cx1="http://schemas.microsoft.com/office/drawing/2015/9/8/chartex" xmlns:cx2="http://schemas.microsoft.com/office/drawing/2015/10/21/chartex" xmlns:cx3="http://schemas.microsoft.com/office/drawing/2016/5/9/chartex" xmlns:cx4="http://schemas.microsoft.com/office/drawing/2016/5/10/chartex" xmlns:cx5="http://schemas.microsoft.com/office/drawing/2016/5/11/chartex" xmlns:cx6="http://schemas.microsoft.com/office/drawing/2016/5/12/chartex" xmlns:cx7="http://schemas.microsoft.com/office/drawing/2016/5/13/chartex" xmlns:cx8="http://schemas.microsoft.com/office/drawing/2016/5/14/chartex" xmlns:mc="http://schemas.openxmlformats.org/markup-compatibility/2006" xmlns:aink="http://schemas.microsoft.com/office/drawing/2016/ink" xmlns:am3d="http://schemas.microsoft.com/office/drawing/2017/model3d" xmlns:o="urn:schemas-microsoft-com:office:office" xmlns:oel="http://schemas.microsoft.com/office/2019/extlst" xmlns:r="http://schemas.openxmlformats.org/officeDocument/2006/relationships" xmlns:m="http://schemas.openxmlformats.org/officeDocument/2006/math" xmlns:v="urn:schemas-microsoft-com:vml" xmlns:wp14="http://schemas.microsoft.com/office/word/2010/wordprocessingDrawing" xmlns:wp="http://schemas.openxmlformats.org/drawingml/2006/wordprocessingDrawing" xmlns:w10="urn:schemas-microsoft-com:office:word" xmlns:w="http://schemas.openxmlformats.org/wordprocessingml/2006/main" xmlns:w14="http://schemas.microsoft.com/office/word/2010/wordml" xmlns:w15="http://schemas.microsoft.com/office/word/2012/wordml" xmlns:w16cex="http://schemas.microsoft.com/office/word/2018/wordml/cex" xmlns:w16cid="http://schemas.microsoft.com/office/word/2016/wordml/cid" xmlns:w16="http://schemas.microsoft.com/office/word/2018/wordml" xmlns:w16sdtdh="http://schemas.microsoft.com/office/word/2020/wordml/sdtdatahash" xmlns:w16se="http://schemas.microsoft.com/office/word/2015/wordml/symex" xmlns:wpg="http://schemas.microsoft.com/office/word/2010/wordprocessingGroup" xmlns:wpi="http://schemas.microsoft.com/office/word/2010/wordprocessingInk" xmlns:wne="http://schemas.microsoft.com/office/word/2006/wordml" xmlns:wps="http://schemas.microsoft.com/office/word/2010/wordprocessingShape" mc:Ignorable="w14 w15 w16se w16cid w16 w16cex w16sdtdh wp14">
   <w:body>
     <w:p>
       <w:pPr>
@@ -589,16 +589,7 @@
           <w:sz w:val="24"/>
           <w:szCs w:val="24"/>
         </w:rPr>
-        <w:t>API design</w:t>
-      </w:r>
-      <w:r>
-        <w:rPr>
-          <w:rFonts w:ascii="Arial" w:hAnsi="Arial" w:cs="Arial"/>
-          <w:b/>
-          <w:sz w:val="24"/>
-          <w:szCs w:val="24"/>
-        </w:rPr>
-        <w:t xml:space="preserve"> </w:t>
+        <w:t xml:space="preserve">API design </w:t>
       </w:r>
     </w:p>
     <w:p>
@@ -624,7 +615,21 @@
         <w:rPr>
           <w:rStyle w:val="selected"/>
         </w:rPr>
-        <w:t>GET /api/users</w:t>
+        <w:t>GET /</w:t>
+      </w:r>
+      <w:proofErr w:type="spellStart"/>
+      <w:r>
+        <w:rPr>
+          <w:rStyle w:val="selected"/>
+        </w:rPr>
+        <w:t>api</w:t>
+      </w:r>
+      <w:proofErr w:type="spellEnd"/>
+      <w:r>
+        <w:rPr>
+          <w:rStyle w:val="selected"/>
+        </w:rPr>
+        <w:t>/users</w:t>
       </w:r>
       <w:r>
         <w:rPr>
@@ -636,7 +641,21 @@
         <w:rPr>
           <w:rStyle w:val="selected"/>
         </w:rPr>
-        <w:t>POST /api/posts</w:t>
+        <w:t>POST /</w:t>
+      </w:r>
+      <w:proofErr w:type="spellStart"/>
+      <w:r>
+        <w:rPr>
+          <w:rStyle w:val="selected"/>
+        </w:rPr>
+        <w:t>api</w:t>
+      </w:r>
+      <w:proofErr w:type="spellEnd"/>
+      <w:r>
+        <w:rPr>
+          <w:rStyle w:val="selected"/>
+        </w:rPr>
+        <w:t>/posts</w:t>
       </w:r>
       <w:r>
         <w:rPr>
@@ -748,12 +767,57 @@
     <w:p>
       <w:pPr>
         <w:spacing w:after="120" w:line="360" w:lineRule="auto"/>
+        <w:ind w:left="-6" w:hanging="11"/>
+        <w:rPr>
+          <w:rStyle w:val="selected"/>
+        </w:rPr>
+      </w:pPr>
+    </w:p>
+    <w:p>
+      <w:pPr>
+        <w:keepNext/>
+        <w:pageBreakBefore/>
+        <w:spacing w:after="120" w:line="360" w:lineRule="auto"/>
         <w:ind w:left="0" w:firstLine="0"/>
         <w:rPr>
           <w:rFonts w:ascii="Arial" w:hAnsi="Arial" w:cs="Arial"/>
+          <w:b/>
+          <w:sz w:val="24"/>
+          <w:szCs w:val="24"/>
+        </w:rPr>
+      </w:pPr>
+      <w:r>
+        <w:rPr>
+          <w:rFonts w:ascii="Arial" w:hAnsi="Arial" w:cs="Arial"/>
+          <w:b/>
+          <w:sz w:val="24"/>
+          <w:szCs w:val="24"/>
+        </w:rPr>
+        <w:lastRenderedPageBreak/>
+        <w:t>Gen AI acknowledgement and Chat Log</w:t>
+      </w:r>
+    </w:p>
+    <w:p>
+      <w:pPr>
+        <w:pStyle w:val="ListParagraph"/>
+        <w:keepLines/>
+        <w:numPr>
+          <w:ilvl w:val="0"/>
+          <w:numId w:val="2"/>
+        </w:numPr>
+        <w:spacing w:after="120" w:line="360" w:lineRule="auto"/>
+        <w:rPr>
+          <w:rFonts w:ascii="Arial" w:hAnsi="Arial" w:cs="Arial"/>
           <w:bCs/>
         </w:rPr>
       </w:pPr>
+      <w:r>
+        <w:rPr>
+          <w:rFonts w:ascii="Arial" w:hAnsi="Arial"/>
+          <w:sz w:val="24"/>
+        </w:rPr>
+        <w:t>I acknowledge that I have used GenAI tools to complete this assessment. I used OpenAI Codex to analyse the assessment requirements, help design and implement the MySQL schema, Express API and browser interface, generate original SVG illustrations, assist with tests and troubleshooting, and draft the report and bilingual demonstration script. This statement records the actual assistance used. The applicable GenAI permission must be confirmed against the course policy before submission.</w:t>
+      </w:r>
     </w:p>
     <w:p>
       <w:pPr>
@@ -765,7 +829,72 @@
           <w:rFonts w:ascii="Arial" w:hAnsi="Arial"/>
           <w:sz w:val="24"/>
         </w:rPr>
-        <w:t>AI assistance disclosure: Generative AI assisted the implementation and drafting of this project. Its generated material and automated test results should be reviewed by the student before submission; no unverified real database or video test is claimed here.</w:t>
+        <w:t>Chat log scope: These are selected request excerpts and summaries of AI assistance, not a complete conversation export. The brief's GenAI Use Level is blank; no assessor approval is claimed.</w:t>
+      </w:r>
+    </w:p>
+    <w:p>
+      <w:pPr>
+        <w:keepLines/>
+        <w:spacing w:line="360" w:lineRule="auto" w:after="180"/>
+      </w:pPr>
+      <w:r>
+        <w:rPr>
+          <w:rFonts w:ascii="Arial" w:hAnsi="Arial"/>
+          <w:sz w:val="24"/>
+        </w:rPr>
+        <w:t>27 September 2026 — Request excerpt: “开始做这个项目” and “你可以调用智能体辅助你工作。建立计划，一步一步来。” Codex analysed the brief and planned the project. Delegated agents assisted with requirements, database/API code and frontend code. Codex generated tests and reviewed the outputs.</w:t>
+      </w:r>
+    </w:p>
+    <w:p>
+      <w:pPr>
+        <w:keepLines/>
+        <w:spacing w:line="360" w:lineRule="auto" w:after="180"/>
+      </w:pPr>
+      <w:r>
+        <w:rPr>
+          <w:rFonts w:ascii="Arial" w:hAnsi="Arial"/>
+          <w:sz w:val="24"/>
+        </w:rPr>
+        <w:t>28 September 2026 — Request excerpt: “链接BingruSong的GitHub账号 接着完成任务”. Codex created and pushed the repository. After the explicit request “你直接设置为公开吧，谁都可以访问”, it explained the conflict with the brief's visibility requirement and made the repository public.</w:t>
+      </w:r>
+    </w:p>
+    <w:p>
+      <w:pPr>
+        <w:keepLines/>
+        <w:spacing w:line="360" w:lineRule="auto" w:after="180"/>
+      </w:pPr>
+      <w:r>
+        <w:rPr>
+          <w:rFonts w:ascii="Arial" w:hAnsi="Arial"/>
+          <w:sz w:val="24"/>
+        </w:rPr>
+        <w:t>28 September 2026 — Request excerpts: “包括视频演讲稿（中英双语带操作提醒）” and “演讲稿做成word，重新放进去”. Codex drafted and formatted the bilingual Word script with timing budgets and screen actions. It did not record or upload a video.</w:t>
+      </w:r>
+    </w:p>
+    <w:p>
+      <w:pPr>
+        <w:keepLines/>
+        <w:spacing w:line="360" w:lineRule="auto" w:after="180"/>
+      </w:pPr>
+      <w:r>
+        <w:rPr>
+          <w:rFonts w:ascii="Arial" w:hAnsi="Arial"/>
+          <w:sz w:val="24"/>
+        </w:rPr>
+        <w:t>28 September 2026 — Request excerpt: “按照这个新模板来写，写好后替换掉源文件里的word”. Codex filled this updated template, acknowledged actual AI use and inspected the rendered report. Identity fields remain blank.</w:t>
+      </w:r>
+    </w:p>
+    <w:p>
+      <w:pPr>
+        <w:keepLines/>
+        <w:spacing w:line="360" w:lineRule="auto" w:after="180"/>
+      </w:pPr>
+      <w:r>
+        <w:rPr>
+          <w:rFonts w:ascii="Arial" w:hAnsi="Arial"/>
+          <w:sz w:val="24"/>
+        </w:rPr>
+        <w:t>Verification boundary: Route/filter tests and browser checks used a database stub. Live MySQL verification remains pending because the local environment has no MySQL server or CLI. The student must review the work and supply a full conversation export if the Unit Assessor requires it.</w:t>
       </w:r>
     </w:p>
     <w:sectPr>
@@ -778,7 +907,7 @@
 </file>
 
 <file path=word/numbering.xml><?xml version="1.0" encoding="utf-8"?>
-<w:numbering xmlns:wpc="http://schemas.microsoft.com/office/word/2010/wordprocessingCanvas" xmlns:cx="http://schemas.microsoft.com/office/drawing/2014/chartex" xmlns:cx1="http://schemas.microsoft.com/office/drawing/2015/9/8/chartex" xmlns:cx2="http://schemas.microsoft.com/office/drawing/2015/10/21/chartex" xmlns:cx3="http://schemas.microsoft.com/office/drawing/2016/5/9/chartex" xmlns:cx4="http://schemas.microsoft.com/office/drawing/2016/5/10/chartex" xmlns:cx5="http://schemas.microsoft.com/office/drawing/2016/5/11/chartex" xmlns:cx6="http://schemas.microsoft.com/office/drawing/2016/5/12/chartex" xmlns:cx7="http://schemas.microsoft.com/office/drawing/2016/5/13/chartex" xmlns:cx8="http://schemas.microsoft.com/office/drawing/2016/5/14/chartex" xmlns:mc="http://schemas.openxmlformats.org/markup-compatibility/2006" xmlns:aink="http://schemas.microsoft.com/office/drawing/2016/ink" xmlns:am3d="http://schemas.microsoft.com/office/drawing/2017/model3d" xmlns:o="urn:schemas-microsoft-com:office:office" xmlns:oel="http://schemas.microsoft.com/office/2019/extlst" xmlns:r="http://schemas.openxmlformats.org/officeDocument/2006/relationships" xmlns:m="http://schemas.openxmlformats.org/officeDocument/2006/math" xmlns:v="urn:schemas-microsoft-com:vml" xmlns:wp14="http://schemas.microsoft.com/office/word/2010/wordprocessingDrawing" xmlns:wp="http://schemas.openxmlformats.org/drawingml/2006/wordprocessingDrawing" xmlns:w10="urn:schemas-microsoft-com:office:word" xmlns:w="http://schemas.openxmlformats.org/wordprocessingml/2006/main" xmlns:w14="http://schemas.microsoft.com/office/word/2010/wordml" xmlns:w15="http://schemas.microsoft.com/office/word/2012/wordml" xmlns:w16cex="http://schemas.microsoft.com/office/word/2018/wordml/cex" xmlns:w16cid="http://schemas.microsoft.com/office/word/2016/wordml/cid" xmlns:w16="http://schemas.microsoft.com/office/word/2018/wordml" xmlns:w16du="http://schemas.microsoft.com/office/word/2023/wordml/word16du" xmlns:w16sdtdh="http://schemas.microsoft.com/office/word/2020/wordml/sdtdatahash" xmlns:w16sdtfl="http://schemas.microsoft.com/office/word/2024/wordml/sdtformatlock" xmlns:w16se="http://schemas.microsoft.com/office/word/2015/wordml/symex" xmlns:wpg="http://schemas.microsoft.com/office/word/2010/wordprocessingGroup" xmlns:wpi="http://schemas.microsoft.com/office/word/2010/wordprocessingInk" xmlns:wne="http://schemas.microsoft.com/office/word/2006/wordml" xmlns:wps="http://schemas.microsoft.com/office/word/2010/wordprocessingShape" mc:Ignorable="w14 w15 w16se w16cid w16 w16cex w16sdtdh w16sdtfl w16du wp14">
+<w:numbering xmlns:wpc="http://schemas.microsoft.com/office/word/2010/wordprocessingCanvas" xmlns:cx="http://schemas.microsoft.com/office/drawing/2014/chartex" xmlns:cx1="http://schemas.microsoft.com/office/drawing/2015/9/8/chartex" xmlns:cx2="http://schemas.microsoft.com/office/drawing/2015/10/21/chartex" xmlns:cx3="http://schemas.microsoft.com/office/drawing/2016/5/9/chartex" xmlns:cx4="http://schemas.microsoft.com/office/drawing/2016/5/10/chartex" xmlns:cx5="http://schemas.microsoft.com/office/drawing/2016/5/11/chartex" xmlns:cx6="http://schemas.microsoft.com/office/drawing/2016/5/12/chartex" xmlns:cx7="http://schemas.microsoft.com/office/drawing/2016/5/13/chartex" xmlns:cx8="http://schemas.microsoft.com/office/drawing/2016/5/14/chartex" xmlns:mc="http://schemas.openxmlformats.org/markup-compatibility/2006" xmlns:aink="http://schemas.microsoft.com/office/drawing/2016/ink" xmlns:am3d="http://schemas.microsoft.com/office/drawing/2017/model3d" xmlns:o="urn:schemas-microsoft-com:office:office" xmlns:oel="http://schemas.microsoft.com/office/2019/extlst" xmlns:r="http://schemas.openxmlformats.org/officeDocument/2006/relationships" xmlns:m="http://schemas.openxmlformats.org/officeDocument/2006/math" xmlns:v="urn:schemas-microsoft-com:vml" xmlns:wp14="http://schemas.microsoft.com/office/word/2010/wordprocessingDrawing" xmlns:wp="http://schemas.openxmlformats.org/drawingml/2006/wordprocessingDrawing" xmlns:w10="urn:schemas-microsoft-com:office:word" xmlns:w="http://schemas.openxmlformats.org/wordprocessingml/2006/main" xmlns:w14="http://schemas.microsoft.com/office/word/2010/wordml" xmlns:w15="http://schemas.microsoft.com/office/word/2012/wordml" xmlns:w16cex="http://schemas.microsoft.com/office/word/2018/wordml/cex" xmlns:w16cid="http://schemas.microsoft.com/office/word/2016/wordml/cid" xmlns:w16="http://schemas.microsoft.com/office/word/2018/wordml" xmlns:w16sdtdh="http://schemas.microsoft.com/office/word/2020/wordml/sdtdatahash" xmlns:w16se="http://schemas.microsoft.com/office/word/2015/wordml/symex" xmlns:wpg="http://schemas.microsoft.com/office/word/2010/wordprocessingGroup" xmlns:wpi="http://schemas.microsoft.com/office/word/2010/wordprocessingInk" xmlns:wne="http://schemas.microsoft.com/office/word/2006/wordml" xmlns:wps="http://schemas.microsoft.com/office/word/2010/wordprocessingShape" mc:Ignorable="w14 w15 w16se w16cid w16 w16cex w16sdtdh wp14">
   <w:abstractNum w:abstractNumId="0" w15:restartNumberingAfterBreak="0">
     <w:nsid w:val="37A576E2"/>
     <w:multiLevelType w:val="hybridMultilevel"/>
@@ -892,14 +1021,106 @@
       </w:rPr>
     </w:lvl>
   </w:abstractNum>
+  <w:abstractNum w:abstractNumId="1" w15:restartNumberingAfterBreak="0">
+    <w:nsid w:val="59183AFE"/>
+    <w:multiLevelType w:val="hybridMultilevel"/>
+    <w:tmpl w:val="75E0898E"/>
+    <w:lvl w:ilvl="0" w:tplc="0409000F">
+      <w:start w:val="1"/>
+      <w:numFmt w:val="decimal"/>
+      <w:lvlText w:val="%1."/>
+      <w:lvlJc w:val="left"/>
+      <w:pPr>
+        <w:ind w:left="720" w:hanging="360"/>
+      </w:pPr>
+      <w:rPr>
+        <w:rFonts w:hint="default"/>
+      </w:rPr>
+    </w:lvl>
+    <w:lvl w:ilvl="1" w:tplc="04090019" w:tentative="1">
+      <w:start w:val="1"/>
+      <w:numFmt w:val="lowerLetter"/>
+      <w:lvlText w:val="%2."/>
+      <w:lvlJc w:val="left"/>
+      <w:pPr>
+        <w:ind w:left="1440" w:hanging="360"/>
+      </w:pPr>
+    </w:lvl>
+    <w:lvl w:ilvl="2" w:tplc="0409001B" w:tentative="1">
+      <w:start w:val="1"/>
+      <w:numFmt w:val="lowerRoman"/>
+      <w:lvlText w:val="%3."/>
+      <w:lvlJc w:val="right"/>
+      <w:pPr>
+        <w:ind w:left="2160" w:hanging="180"/>
+      </w:pPr>
+    </w:lvl>
+    <w:lvl w:ilvl="3" w:tplc="0409000F" w:tentative="1">
+      <w:start w:val="1"/>
+      <w:numFmt w:val="decimal"/>
+      <w:lvlText w:val="%4."/>
+      <w:lvlJc w:val="left"/>
+      <w:pPr>
+        <w:ind w:left="2880" w:hanging="360"/>
+      </w:pPr>
+    </w:lvl>
+    <w:lvl w:ilvl="4" w:tplc="04090019" w:tentative="1">
+      <w:start w:val="1"/>
+      <w:numFmt w:val="lowerLetter"/>
+      <w:lvlText w:val="%5."/>
+      <w:lvlJc w:val="left"/>
+      <w:pPr>
+        <w:ind w:left="3600" w:hanging="360"/>
+      </w:pPr>
+    </w:lvl>
+    <w:lvl w:ilvl="5" w:tplc="0409001B" w:tentative="1">
+      <w:start w:val="1"/>
+      <w:numFmt w:val="lowerRoman"/>
+      <w:lvlText w:val="%6."/>
+      <w:lvlJc w:val="right"/>
+      <w:pPr>
+        <w:ind w:left="4320" w:hanging="180"/>
+      </w:pPr>
+    </w:lvl>
+    <w:lvl w:ilvl="6" w:tplc="0409000F" w:tentative="1">
+      <w:start w:val="1"/>
+      <w:numFmt w:val="decimal"/>
+      <w:lvlText w:val="%7."/>
+      <w:lvlJc w:val="left"/>
+      <w:pPr>
+        <w:ind w:left="5040" w:hanging="360"/>
+      </w:pPr>
+    </w:lvl>
+    <w:lvl w:ilvl="7" w:tplc="04090019" w:tentative="1">
+      <w:start w:val="1"/>
+      <w:numFmt w:val="lowerLetter"/>
+      <w:lvlText w:val="%8."/>
+      <w:lvlJc w:val="left"/>
+      <w:pPr>
+        <w:ind w:left="5760" w:hanging="360"/>
+      </w:pPr>
+    </w:lvl>
+    <w:lvl w:ilvl="8" w:tplc="0409001B" w:tentative="1">
+      <w:start w:val="1"/>
+      <w:numFmt w:val="lowerRoman"/>
+      <w:lvlText w:val="%9."/>
+      <w:lvlJc w:val="right"/>
+      <w:pPr>
+        <w:ind w:left="6480" w:hanging="180"/>
+      </w:pPr>
+    </w:lvl>
+  </w:abstractNum>
   <w:num w:numId="1" w16cid:durableId="1139109609">
     <w:abstractNumId w:val="0"/>
+  </w:num>
+  <w:num w:numId="2" w16cid:durableId="52892197">
+    <w:abstractNumId w:val="1"/>
   </w:num>
 </w:numbering>
 </file>
 
 <file path=word/styles.xml><?xml version="1.0" encoding="utf-8"?>
-<w:styles xmlns:mc="http://schemas.openxmlformats.org/markup-compatibility/2006" xmlns:r="http://schemas.openxmlformats.org/officeDocument/2006/relationships" xmlns:w="http://schemas.openxmlformats.org/wordprocessingml/2006/main" xmlns:w14="http://schemas.microsoft.com/office/word/2010/wordml" xmlns:w15="http://schemas.microsoft.com/office/word/2012/wordml" xmlns:w16cex="http://schemas.microsoft.com/office/word/2018/wordml/cex" xmlns:w16cid="http://schemas.microsoft.com/office/word/2016/wordml/cid" xmlns:w16="http://schemas.microsoft.com/office/word/2018/wordml" xmlns:w16du="http://schemas.microsoft.com/office/word/2023/wordml/word16du" xmlns:w16sdtdh="http://schemas.microsoft.com/office/word/2020/wordml/sdtdatahash" xmlns:w16sdtfl="http://schemas.microsoft.com/office/word/2024/wordml/sdtformatlock" xmlns:w16se="http://schemas.microsoft.com/office/word/2015/wordml/symex" mc:Ignorable="w14 w15 w16se w16cid w16 w16cex w16sdtdh w16sdtfl w16du">
+<w:styles xmlns:mc="http://schemas.openxmlformats.org/markup-compatibility/2006" xmlns:r="http://schemas.openxmlformats.org/officeDocument/2006/relationships" xmlns:w="http://schemas.openxmlformats.org/wordprocessingml/2006/main" xmlns:w14="http://schemas.microsoft.com/office/word/2010/wordml" xmlns:w15="http://schemas.microsoft.com/office/word/2012/wordml" xmlns:w16cex="http://schemas.microsoft.com/office/word/2018/wordml/cex" xmlns:w16cid="http://schemas.microsoft.com/office/word/2016/wordml/cid" xmlns:w16="http://schemas.microsoft.com/office/word/2018/wordml" xmlns:w16sdtdh="http://schemas.microsoft.com/office/word/2020/wordml/sdtdatahash" xmlns:w16se="http://schemas.microsoft.com/office/word/2015/wordml/symex" mc:Ignorable="w14 w15 w16se w16cid w16 w16cex w16sdtdh">
   <w:docDefaults>
     <w:rPrDefault>
       <w:rPr>

</xml_diff>